<commit_message>
Session 155: Edition 3 updated — deactivation guard to Recently completed (live July 25); Erica Kind's leftover RED surfaced in In Your Court
Co-Authored-By: Claude Fable 5 <noreply@anthropic.com>
</commit_message>
<xml_diff>
--- a/verticals/workforce_monitoring/tenants/wi_php/project_status/PI2_Master_Build_List_2026-07-31.docx
+++ b/verticals/workforce_monitoring/tenants/wi_php/project_status/PI2_Master_Build_List_2026-07-31.docx
@@ -163,6 +163,31 @@
           <w:b/>
           <w:bCs/>
         </w:rPr>
+        <w:t xml:space="preserve">July 25 — the deactivation guard (your decision of July 23, built to your words):</w:t>
+      </w:r>
+      <w:r>
+        <w:t xml:space="preserve"> nobody can be deactivated while they still carry open registry items. The system stops at the door and lists exactly what's open — urgency, reason, and the date each item was opened — so everything is completed, defensible, and no safety item is left unseen. Resolving the items unlocks the door; reactivating someone was never blocked. One piece of housekeeping this surfaces: </w:t>
+      </w:r>
+      <w:r>
+        <w:rPr>
+          <w:b/>
+          <w:bCs/>
+        </w:rPr>
+        <w:t xml:space="preserve">one already-deactivated test person (Erica Kind) carries an open overdue RED item from before the guard existed</w:t>
+      </w:r>
+      <w:r>
+        <w:t xml:space="preserve"> — the guard can't reach back, so that one needs your team to resolve it clinically, and then the books are clean.</w:t>
+      </w:r>
+    </w:p>
+    <w:p>
+      <w:pPr>
+        <w:spacing w:after="120"/>
+      </w:pPr>
+      <w:r>
+        <w:rPr>
+          <w:b/>
+          <w:bCs/>
+        </w:rPr>
         <w:t xml:space="preserve">July 22-23 — the "No longer needed" follow-up outcome (your suggestion, same-week)</w:t>
       </w:r>
       <w:r>
@@ -275,13 +300,22 @@
       </w:pPr>
       <w:r>
         <w:rPr>
-          <w:b/>
-          <w:bCs/>
+          <w:strike/>
         </w:rPr>
         <w:t xml:space="preserve">Deactivation guard for open registry items</w:t>
       </w:r>
       <w:r>
-        <w:t xml:space="preserve"> — your decision (July 23): no one can be deactivated while they still carry open registry items; the system stops at the door and says what's open, so everything is completed, defensible, and no safety item is left unseen. Design decided; ready to build when it reaches the top.</w:t>
+        <w:t xml:space="preserve"> — </w:t>
+      </w:r>
+      <w:r>
+        <w:rPr>
+          <w:b/>
+          <w:bCs/>
+        </w:rPr>
+        <w:t xml:space="preserve">built and live July 25</w:t>
+      </w:r>
+      <w:r>
+        <w:t xml:space="preserve"> (see Recently completed).</w:t>
       </w:r>
     </w:p>
     <w:p>
@@ -1003,6 +1037,26 @@
       </w:r>
       <w:r>
         <w:t xml:space="preserve"> — it's live and empty; your team adds the entities (your program list and the IHS pool)</w:t>
+      </w:r>
+    </w:p>
+    <w:p>
+      <w:pPr>
+        <w:pStyle w:val="ListParagraph"/>
+        <w:numPr>
+          <w:ilvl w:val="0"/>
+          <w:numId w:val="3"/>
+        </w:numPr>
+        <w:spacing w:after="60"/>
+      </w:pPr>
+      <w:r>
+        <w:rPr>
+          <w:b/>
+          <w:bCs/>
+        </w:rPr>
+        <w:t xml:space="preserve">Erica Kind's leftover open RED item</w:t>
+      </w:r>
+      <w:r>
+        <w:t xml:space="preserve"> — deactivated before the guard existed; needs a clinical resolution so nothing sits unseen</w:t>
       </w:r>
     </w:p>
     <w:p>

</xml_diff>

<commit_message>
Session 159: master list Edition 3 regenerated — the week of foundations folded in
The Friday July 31 edition, refreshed to cover everything that shipped
since the July 25 draft: the two visible touches on Erica's screens
("View chart" wording, the honest empty health-system picker) and the
two platform foundations described in her language — the engagement
rules engine (deliberately NOT called MEDS, which means her clinical
detector) and the outbound messaging foundation with its consent gate
shipping locked for her programs. Consent architecture section notes
the plumbing now waits behind her gate; the future-list secure
messaging and escalate-until-acknowledged items note what now exists.
Directory Phase 1 + selection wall remain the headline (first edition
to tell her). .docx regenerated from the .md and content-verified;
send still planned Friday on Bill's go.

Co-Authored-By: Claude Fable 5 <noreply@anthropic.com>
</commit_message>
<xml_diff>
--- a/verticals/workforce_monitoring/tenants/wi_php/project_status/PI2_Master_Build_List_2026-07-31.docx
+++ b/verticals/workforce_monitoring/tenants/wi_php/project_status/PI2_Master_Build_List_2026-07-31.docx
@@ -7,22 +7,17 @@
         <w:pStyle w:val="Title"/>
       </w:pPr>
       <w:r>
-        <w:rPr>
-          <w:b/>
-          <w:bCs/>
-        </w:rPr>
         <w:t xml:space="preserve">PI² Master Build List</w:t>
       </w:r>
     </w:p>
     <w:p>
       <w:pPr>
-        <w:spacing w:after="240"/>
-      </w:pPr>
-      <w:r>
-        <w:rPr>
-          <w:b/>
-          <w:bCs/>
-          <w:color w:val="555555"/>
+        <w:spacing w:after="120"/>
+      </w:pPr>
+      <w:r>
+        <w:rPr>
+          <w:b/>
+          <w:bCs/>
         </w:rPr>
         <w:t xml:space="preserve">Edition 3 · July 31, 2026</w:t>
       </w:r>
@@ -32,7 +27,7 @@
         <w:spacing w:after="120"/>
       </w:pPr>
       <w:r>
-        <w:t xml:space="preserve">Erica — the weekly edition, as promised. The headline this week is your #3: the Network Directory is live, and the first piece of its second phase — the privacy wall around participant selections — is built and running. Three asks, two of them carried:</w:t>
+        <w:t xml:space="preserve">Erica — the weekly edition, as promised. The headline is your #3: the Network Directory is live, and the first piece of its second phase — the privacy wall around participant selections — is built and running. This past week was quieter on your screens and louder underneath: the platform grew an engagement rules engine and the full outbound messaging foundation — plumbing that waits behind your consent architecture (details below). Three asks, two of them carried:</w:t>
       </w:r>
     </w:p>
     <w:p>
@@ -42,7 +37,7 @@
           <w:ilvl w:val="0"/>
           <w:numId w:val="2"/>
         </w:numPr>
-        <w:spacing w:after="60"/>
+        <w:spacing w:after="80"/>
       </w:pPr>
       <w:r>
         <w:rPr>
@@ -62,7 +57,7 @@
           <w:ilvl w:val="0"/>
           <w:numId w:val="2"/>
         </w:numPr>
-        <w:spacing w:after="60"/>
+        <w:spacing w:after="80"/>
       </w:pPr>
       <w:r>
         <w:rPr>
@@ -82,7 +77,7 @@
           <w:ilvl w:val="0"/>
           <w:numId w:val="2"/>
         </w:numPr>
-        <w:spacing w:after="60"/>
+        <w:spacing w:after="80"/>
       </w:pPr>
       <w:r>
         <w:rPr>
@@ -98,7 +93,7 @@
     <w:p>
       <w:pPr>
         <w:pStyle w:val="Heading1"/>
-        <w:spacing w:after="120" w:before="280"/>
+        <w:spacing w:after="100" w:before="280"/>
       </w:pPr>
       <w:r>
         <w:t xml:space="preserve">✅ Recently completed — everything below is LIVE on your site</w:t>
@@ -177,6 +172,91 @@
       </w:r>
       <w:r>
         <w:t xml:space="preserve"> — the guard can't reach back, so that one needs your team to resolve it clinically, and then the books are clean.</w:t>
+      </w:r>
+    </w:p>
+    <w:p>
+      <w:pPr>
+        <w:spacing w:after="120"/>
+      </w:pPr>
+      <w:r>
+        <w:rPr>
+          <w:b/>
+          <w:bCs/>
+        </w:rPr>
+        <w:t xml:space="preserve">July 26-27 — two small visible touches, and two large foundations underneath.</w:t>
+      </w:r>
+      <w:r>
+        <w:t xml:space="preserve"> The visible pair: the registry's item view button now reads </w:t>
+      </w:r>
+      <w:r>
+        <w:rPr>
+          <w:b/>
+          <w:bCs/>
+        </w:rPr>
+        <w:t xml:space="preserve">"View chart"</w:t>
+      </w:r>
+      <w:r>
+        <w:t xml:space="preserve"> (your wording, matching the intake queue), and the health-system picker now says </w:t>
+      </w:r>
+      <w:r>
+        <w:rPr>
+          <w:b/>
+          <w:bCs/>
+        </w:rPr>
+        <w:t xml:space="preserve">"No health systems configured yet"</w:t>
+      </w:r>
+      <w:r>
+        <w:t xml:space="preserve"> instead of opening an empty window — Washington shows that honestly until its kickoff configuration, on purpose; no placeholder data on a production-bound program. Underneath, two platform foundations you'll feel later rather than see now:</w:t>
+      </w:r>
+    </w:p>
+    <w:p>
+      <w:pPr>
+        <w:pStyle w:val="ListParagraph"/>
+        <w:numPr>
+          <w:ilvl w:val="0"/>
+          <w:numId w:val="3"/>
+        </w:numPr>
+        <w:spacing w:after="60"/>
+      </w:pPr>
+      <w:r>
+        <w:rPr>
+          <w:b/>
+          <w:bCs/>
+        </w:rPr>
+        <w:t xml:space="preserve">An engagement rules engine</w:t>
+      </w:r>
+      <w:r>
+        <w:t xml:space="preserve"> — define a condition once (for example, "no activity in 60 days") and the platform checks everyone against it daily and acts exactly once per episode, never nagging the same person twice. Your clinical monitoring machinery is completely separate and untouched — this is the general-purpose engine that future monitoring-track features (reminders, check-in nudges, escalation) will be built on.</w:t>
+      </w:r>
+    </w:p>
+    <w:p>
+      <w:pPr>
+        <w:pStyle w:val="ListParagraph"/>
+        <w:numPr>
+          <w:ilvl w:val="0"/>
+          <w:numId w:val="3"/>
+        </w:numPr>
+        <w:spacing w:after="60"/>
+      </w:pPr>
+      <w:r>
+        <w:rPr>
+          <w:b/>
+          <w:bCs/>
+        </w:rPr>
+        <w:t xml:space="preserve">The outbound messaging foundation</w:t>
+      </w:r>
+      <w:r>
+        <w:t xml:space="preserve"> — every future email or text to a member now flows through one queue with an address snapshot, delivery receipts, bounce history that heals itself when an address is corrected, and a do-not-contact rulebook. </w:t>
+      </w:r>
+      <w:r>
+        <w:rPr>
+          <w:b/>
+          <w:bCs/>
+        </w:rPr>
+        <w:t xml:space="preserve">For your programs the messaging door ships locked:</w:t>
+      </w:r>
+      <w:r>
+        <w:t xml:space="preserve"> no participant can be emailed or texted until your consent architecture deliberately opens it — it cannot happen by accident or misconfiguration. No delivery provider is connected yet (that vendor choice is ours, still ahead); the machinery is built and waiting.</w:t>
       </w:r>
     </w:p>
     <w:p>
@@ -219,7 +299,7 @@
     <w:p>
       <w:pPr>
         <w:pStyle w:val="Heading1"/>
-        <w:spacing w:after="120" w:before="280"/>
+        <w:spacing w:after="100" w:before="280"/>
       </w:pPr>
       <w:r>
         <w:t xml:space="preserve">🐞 Bugs</w:t>
@@ -236,7 +316,7 @@
     <w:p>
       <w:pPr>
         <w:pStyle w:val="Heading1"/>
-        <w:spacing w:after="120" w:before="280"/>
+        <w:spacing w:after="100" w:before="280"/>
       </w:pPr>
       <w:r>
         <w:t xml:space="preserve">🔹 Small Enhancements</w:t>
@@ -247,9 +327,9 @@
         <w:pStyle w:val="ListParagraph"/>
         <w:numPr>
           <w:ilvl w:val="0"/>
-          <w:numId w:val="2"/>
-        </w:numPr>
-        <w:spacing w:after="60"/>
+          <w:numId w:val="4"/>
+        </w:numPr>
+        <w:spacing w:after="80"/>
       </w:pPr>
       <w:r>
         <w:rPr>
@@ -274,9 +354,9 @@
         <w:pStyle w:val="ListParagraph"/>
         <w:numPr>
           <w:ilvl w:val="0"/>
-          <w:numId w:val="2"/>
-        </w:numPr>
-        <w:spacing w:after="60"/>
+          <w:numId w:val="4"/>
+        </w:numPr>
+        <w:spacing w:after="80"/>
       </w:pPr>
       <w:r>
         <w:rPr>
@@ -294,9 +374,9 @@
         <w:pStyle w:val="ListParagraph"/>
         <w:numPr>
           <w:ilvl w:val="0"/>
-          <w:numId w:val="2"/>
-        </w:numPr>
-        <w:spacing w:after="60"/>
+          <w:numId w:val="4"/>
+        </w:numPr>
+        <w:spacing w:after="80"/>
       </w:pPr>
       <w:r>
         <w:rPr>
@@ -321,7 +401,7 @@
     <w:p>
       <w:pPr>
         <w:pStyle w:val="Heading1"/>
-        <w:spacing w:after="120" w:before="280"/>
+        <w:spacing w:after="100" w:before="280"/>
       </w:pPr>
       <w:r>
         <w:t xml:space="preserve">🔷 Large Enhancements — YOUR RANKING (received July 20) is the build order</w:t>
@@ -414,6 +494,29 @@
     </w:p>
     <w:p>
       <w:pPr>
+        <w:pStyle w:val="ListParagraph"/>
+        <w:numPr>
+          <w:ilvl w:val="0"/>
+          <w:numId w:val="3"/>
+        </w:numPr>
+        <w:spacing w:after="60"/>
+      </w:pPr>
+      <w:r>
+        <w:t xml:space="preserve">New since last edition: </w:t>
+      </w:r>
+      <w:r>
+        <w:rPr>
+          <w:b/>
+          <w:bCs/>
+        </w:rPr>
+        <w:t xml:space="preserve">the messaging plumbing itself is now built and waiting</w:t>
+      </w:r>
+      <w:r>
+        <w:t xml:space="preserve"> (the queue, receipts, and bounce handling — see Recently completed), behind a consent gate that ships locked for your programs. When your consent architecture says go, the door opens deliberately; nothing needs to be rebuilt.</w:t>
+      </w:r>
+    </w:p>
+    <w:p>
+      <w:pPr>
         <w:pStyle w:val="Heading2"/>
         <w:spacing w:after="80" w:before="200"/>
       </w:pPr>
@@ -692,7 +795,7 @@
     <w:p>
       <w:pPr>
         <w:pStyle w:val="Heading1"/>
-        <w:spacing w:after="120" w:before="280"/>
+        <w:spacing w:after="100" w:before="280"/>
       </w:pPr>
       <w:r>
         <w:t xml:space="preserve">🗻 Washington's wish list (received July 22 — your ranking pending)</w:t>
@@ -716,7 +819,7 @@
     <w:p>
       <w:pPr>
         <w:pStyle w:val="Heading1"/>
-        <w:spacing w:after="120" w:before="280"/>
+        <w:spacing w:after="100" w:before="280"/>
       </w:pPr>
       <w:r>
         <w:t xml:space="preserve">🔮 Maybe in the Future</w:t>
@@ -812,168 +915,182 @@
         <w:spacing w:after="60"/>
       </w:pPr>
       <w:r>
-        <w:t xml:space="preserve">Secure messaging</w:t>
-      </w:r>
-    </w:p>
-    <w:p>
-      <w:pPr>
-        <w:pStyle w:val="ListParagraph"/>
-        <w:numPr>
-          <w:ilvl w:val="0"/>
-          <w:numId w:val="3"/>
-        </w:numPr>
-        <w:spacing w:after="60"/>
-      </w:pPr>
-      <w:r>
-        <w:t xml:space="preserve">Camera document capture</w:t>
-      </w:r>
-    </w:p>
-    <w:p>
-      <w:pPr>
-        <w:pStyle w:val="ListParagraph"/>
-        <w:numPr>
-          <w:ilvl w:val="0"/>
-          <w:numId w:val="3"/>
-        </w:numPr>
-        <w:spacing w:after="60"/>
-      </w:pPr>
-      <w:r>
-        <w:t xml:space="preserve">In-app billing and ledger</w:t>
-      </w:r>
-    </w:p>
-    <w:p>
-      <w:pPr>
-        <w:pStyle w:val="ListParagraph"/>
-        <w:numPr>
-          <w:ilvl w:val="0"/>
-          <w:numId w:val="3"/>
-        </w:numPr>
-        <w:spacing w:after="60"/>
-      </w:pPr>
-      <w:r>
-        <w:t xml:space="preserve">Meeting-attendance GPS</w:t>
-      </w:r>
-    </w:p>
-    <w:p>
-      <w:pPr>
-        <w:pStyle w:val="ListParagraph"/>
-        <w:numPr>
-          <w:ilvl w:val="0"/>
-          <w:numId w:val="3"/>
-        </w:numPr>
-        <w:spacing w:after="60"/>
-      </w:pPr>
-      <w:r>
-        <w:t xml:space="preserve">Travel and medical time-off requests, with a forms library</w:t>
-      </w:r>
-    </w:p>
-    <w:p>
-      <w:pPr>
-        <w:spacing w:after="120"/>
-      </w:pPr>
-      <w:r>
-        <w:rPr>
-          <w:b/>
-          <w:bCs/>
-        </w:rPr>
-        <w:t xml:space="preserve">And beyond:</w:t>
-      </w:r>
-    </w:p>
-    <w:p>
-      <w:pPr>
-        <w:pStyle w:val="ListParagraph"/>
-        <w:numPr>
-          <w:ilvl w:val="0"/>
-          <w:numId w:val="3"/>
-        </w:numPr>
-        <w:spacing w:after="60"/>
-      </w:pPr>
-      <w:r>
-        <w:t xml:space="preserve">Toxicology / lab ordering and results</w:t>
-      </w:r>
-    </w:p>
-    <w:p>
-      <w:pPr>
-        <w:pStyle w:val="ListParagraph"/>
-        <w:numPr>
-          <w:ilvl w:val="0"/>
-          <w:numId w:val="3"/>
-        </w:numPr>
-        <w:spacing w:after="60"/>
-      </w:pPr>
-      <w:r>
-        <w:t xml:space="preserve">Treatment Provider Network — application, nine-domain scoring, network tiers, referral routing, the communication obligations, real-time professional-bed availability</w:t>
-      </w:r>
-    </w:p>
-    <w:p>
-      <w:pPr>
-        <w:pStyle w:val="ListParagraph"/>
-        <w:numPr>
-          <w:ilvl w:val="0"/>
-          <w:numId w:val="3"/>
-        </w:numPr>
-        <w:spacing w:after="60"/>
-      </w:pPr>
-      <w:r>
-        <w:t xml:space="preserve">Escalate-until-acknowledged alerting — a critical alert walks text → call → app until receipt is confirmed (messaging provider needed first)</w:t>
-      </w:r>
-    </w:p>
-    <w:p>
-      <w:pPr>
-        <w:pStyle w:val="ListParagraph"/>
-        <w:numPr>
-          <w:ilvl w:val="0"/>
-          <w:numId w:val="3"/>
-        </w:numPr>
-        <w:spacing w:after="60"/>
-      </w:pPr>
-      <w:r>
-        <w:t xml:space="preserve">Appointment and reminder machinery — proposed times, calendar invites, day-of reminders (consent-gated)</w:t>
-      </w:r>
-    </w:p>
-    <w:p>
-      <w:pPr>
-        <w:pStyle w:val="ListParagraph"/>
-        <w:numPr>
-          <w:ilvl w:val="0"/>
-          <w:numId w:val="3"/>
-        </w:numPr>
-        <w:spacing w:after="60"/>
-      </w:pPr>
-      <w:r>
-        <w:t xml:space="preserve">Board reporting (counsel-gated)</w:t>
-      </w:r>
-    </w:p>
-    <w:p>
-      <w:pPr>
-        <w:pStyle w:val="ListParagraph"/>
-        <w:numPr>
-          <w:ilvl w:val="0"/>
-          <w:numId w:val="3"/>
-        </w:numPr>
-        <w:spacing w:after="60"/>
-      </w:pPr>
-      <w:r>
-        <w:rPr>
-          <w:strike/>
-        </w:rPr>
-        <w:t xml:space="preserve">Standing up the second state</w:t>
-      </w:r>
-      <w:r>
-        <w:t xml:space="preserve"> — </w:t>
+        <w:t xml:space="preserve">Secure messaging </w:t>
       </w:r>
       <w:r>
         <w:rPr>
           <w:i/>
           <w:iCs/>
         </w:rPr>
+        <w:t xml:space="preserve">(the delivery plumbing now exists — waits on your consent architecture and a provider choice)</w:t>
+      </w:r>
+    </w:p>
+    <w:p>
+      <w:pPr>
+        <w:pStyle w:val="ListParagraph"/>
+        <w:numPr>
+          <w:ilvl w:val="0"/>
+          <w:numId w:val="3"/>
+        </w:numPr>
+        <w:spacing w:after="60"/>
+      </w:pPr>
+      <w:r>
+        <w:t xml:space="preserve">Camera document capture</w:t>
+      </w:r>
+    </w:p>
+    <w:p>
+      <w:pPr>
+        <w:pStyle w:val="ListParagraph"/>
+        <w:numPr>
+          <w:ilvl w:val="0"/>
+          <w:numId w:val="3"/>
+        </w:numPr>
+        <w:spacing w:after="60"/>
+      </w:pPr>
+      <w:r>
+        <w:t xml:space="preserve">In-app billing and ledger</w:t>
+      </w:r>
+    </w:p>
+    <w:p>
+      <w:pPr>
+        <w:pStyle w:val="ListParagraph"/>
+        <w:numPr>
+          <w:ilvl w:val="0"/>
+          <w:numId w:val="3"/>
+        </w:numPr>
+        <w:spacing w:after="60"/>
+      </w:pPr>
+      <w:r>
+        <w:t xml:space="preserve">Meeting-attendance GPS</w:t>
+      </w:r>
+    </w:p>
+    <w:p>
+      <w:pPr>
+        <w:pStyle w:val="ListParagraph"/>
+        <w:numPr>
+          <w:ilvl w:val="0"/>
+          <w:numId w:val="3"/>
+        </w:numPr>
+        <w:spacing w:after="60"/>
+      </w:pPr>
+      <w:r>
+        <w:t xml:space="preserve">Travel and medical time-off requests, with a forms library</w:t>
+      </w:r>
+    </w:p>
+    <w:p>
+      <w:pPr>
+        <w:spacing w:after="120"/>
+      </w:pPr>
+      <w:r>
+        <w:rPr>
+          <w:b/>
+          <w:bCs/>
+        </w:rPr>
+        <w:t xml:space="preserve">And beyond:</w:t>
+      </w:r>
+    </w:p>
+    <w:p>
+      <w:pPr>
+        <w:pStyle w:val="ListParagraph"/>
+        <w:numPr>
+          <w:ilvl w:val="0"/>
+          <w:numId w:val="3"/>
+        </w:numPr>
+        <w:spacing w:after="60"/>
+      </w:pPr>
+      <w:r>
+        <w:t xml:space="preserve">Toxicology / lab ordering and results</w:t>
+      </w:r>
+    </w:p>
+    <w:p>
+      <w:pPr>
+        <w:pStyle w:val="ListParagraph"/>
+        <w:numPr>
+          <w:ilvl w:val="0"/>
+          <w:numId w:val="3"/>
+        </w:numPr>
+        <w:spacing w:after="60"/>
+      </w:pPr>
+      <w:r>
+        <w:t xml:space="preserve">Treatment Provider Network — application, nine-domain scoring, network tiers, referral routing, the communication obligations, real-time professional-bed availability</w:t>
+      </w:r>
+    </w:p>
+    <w:p>
+      <w:pPr>
+        <w:pStyle w:val="ListParagraph"/>
+        <w:numPr>
+          <w:ilvl w:val="0"/>
+          <w:numId w:val="3"/>
+        </w:numPr>
+        <w:spacing w:after="60"/>
+      </w:pPr>
+      <w:r>
+        <w:t xml:space="preserve">Escalate-until-acknowledged alerting — a critical alert walks text → call → app until receipt is confirmed </w:t>
+      </w:r>
+      <w:r>
+        <w:rPr>
+          <w:i/>
+          <w:iCs/>
+        </w:rPr>
+        <w:t xml:space="preserve">(the queue and receipt machinery now exist; a messaging provider is still needed)</w:t>
+      </w:r>
+    </w:p>
+    <w:p>
+      <w:pPr>
+        <w:pStyle w:val="ListParagraph"/>
+        <w:numPr>
+          <w:ilvl w:val="0"/>
+          <w:numId w:val="3"/>
+        </w:numPr>
+        <w:spacing w:after="60"/>
+      </w:pPr>
+      <w:r>
+        <w:t xml:space="preserve">Appointment and reminder machinery — proposed times, calendar invites, day-of reminders (consent-gated)</w:t>
+      </w:r>
+    </w:p>
+    <w:p>
+      <w:pPr>
+        <w:pStyle w:val="ListParagraph"/>
+        <w:numPr>
+          <w:ilvl w:val="0"/>
+          <w:numId w:val="3"/>
+        </w:numPr>
+        <w:spacing w:after="60"/>
+      </w:pPr>
+      <w:r>
+        <w:t xml:space="preserve">Board reporting (counsel-gated)</w:t>
+      </w:r>
+    </w:p>
+    <w:p>
+      <w:pPr>
+        <w:pStyle w:val="ListParagraph"/>
+        <w:numPr>
+          <w:ilvl w:val="0"/>
+          <w:numId w:val="3"/>
+        </w:numPr>
+        <w:spacing w:after="60"/>
+      </w:pPr>
+      <w:r>
+        <w:rPr>
+          <w:strike/>
+        </w:rPr>
+        <w:t xml:space="preserve">Standing up the second state</w:t>
+      </w:r>
+      <w:r>
+        <w:t xml:space="preserve"> — </w:t>
+      </w:r>
+      <w:r>
+        <w:rPr>
+          <w:i/>
+          <w:iCs/>
+        </w:rPr>
         <w:t xml:space="preserve">happening: Washington signed; the wa_php program exists and stands ready for kickoff (~Aug 15)</w:t>
       </w:r>
     </w:p>
     <w:p>
       <w:pPr>
         <w:pStyle w:val="Heading1"/>
-        <w:spacing w:after="120" w:before="280"/>
+        <w:spacing w:after="100" w:before="280"/>
       </w:pPr>
       <w:r>
         <w:t xml:space="preserve">📋 In Your Court</w:t>
@@ -1139,7 +1256,7 @@
     </w:p>
     <w:sectPr>
       <w:pgSz w:w="12240" w:h="15840" w:orient="portrait"/>
-      <w:pgMar w:top="1440" w:right="1440" w:bottom="1440" w:left="1440" w:header="708" w:footer="708" w:gutter="0"/>
+      <w:pgMar w:top="1080" w:right="1260" w:bottom="1080" w:left="1260" w:header="708" w:footer="708" w:gutter="0"/>
       <w:pgNumType/>
       <w:docGrid w:linePitch="360"/>
     </w:sectPr>
@@ -1315,11 +1432,11 @@
     <w:multiLevelType w:val="hybridMultilevel"/>
     <w:lvl w:ilvl="0" w15:tentative="1">
       <w:start w:val="1"/>
-      <w:numFmt w:val="decimal"/>
-      <w:lvlText w:val="%1."/>
-      <w:lvlJc w:val="start"/>
-      <w:pPr>
-        <w:ind w:left="480" w:hanging="240"/>
+      <w:numFmt w:val="bullet"/>
+      <w:lvlText w:val="•"/>
+      <w:lvlJc w:val="left"/>
+      <w:pPr>
+        <w:ind w:left="504" w:hanging="288"/>
       </w:pPr>
     </w:lvl>
   </w:abstractNum>
@@ -1327,11 +1444,47 @@
     <w:multiLevelType w:val="hybridMultilevel"/>
     <w:lvl w:ilvl="0" w15:tentative="1">
       <w:start w:val="1"/>
-      <w:numFmt w:val="bullet"/>
-      <w:lvlText w:val="•"/>
-      <w:lvlJc w:val="start"/>
-      <w:pPr>
-        <w:ind w:left="480" w:hanging="240"/>
+      <w:numFmt w:val="decimal"/>
+      <w:lvlText w:val="%1."/>
+      <w:lvlJc w:val="left"/>
+      <w:pPr>
+        <w:ind w:left="504" w:hanging="360"/>
+      </w:pPr>
+    </w:lvl>
+  </w:abstractNum>
+  <w:abstractNum w:abstractNumId="4" w15:restartNumberingAfterBreak="0">
+    <w:multiLevelType w:val="hybridMultilevel"/>
+    <w:lvl w:ilvl="0" w15:tentative="1">
+      <w:start w:val="1"/>
+      <w:numFmt w:val="decimal"/>
+      <w:lvlText w:val="%1."/>
+      <w:lvlJc w:val="left"/>
+      <w:pPr>
+        <w:ind w:left="504" w:hanging="360"/>
+      </w:pPr>
+    </w:lvl>
+  </w:abstractNum>
+  <w:abstractNum w:abstractNumId="5" w15:restartNumberingAfterBreak="0">
+    <w:multiLevelType w:val="hybridMultilevel"/>
+    <w:lvl w:ilvl="0" w15:tentative="1">
+      <w:start w:val="1"/>
+      <w:numFmt w:val="decimal"/>
+      <w:lvlText w:val="%1."/>
+      <w:lvlJc w:val="left"/>
+      <w:pPr>
+        <w:ind w:left="504" w:hanging="360"/>
+      </w:pPr>
+    </w:lvl>
+  </w:abstractNum>
+  <w:abstractNum w:abstractNumId="6" w15:restartNumberingAfterBreak="0">
+    <w:multiLevelType w:val="hybridMultilevel"/>
+    <w:lvl w:ilvl="0" w15:tentative="1">
+      <w:start w:val="1"/>
+      <w:numFmt w:val="decimal"/>
+      <w:lvlText w:val="%1."/>
+      <w:lvlJc w:val="left"/>
+      <w:pPr>
+        <w:ind w:left="504" w:hanging="360"/>
       </w:pPr>
     </w:lvl>
   </w:abstractNum>
@@ -1342,13 +1495,19 @@
     </w:lvlOverride>
   </w:num>
   <w:num w:numId="2">
+    <w:abstractNumId w:val="3"/>
+    <w:lvlOverride w:ilvl="0">
+      <w:startOverride w:val="1"/>
+    </w:lvlOverride>
+  </w:num>
+  <w:num w:numId="3">
     <w:abstractNumId w:val="2"/>
     <w:lvlOverride w:ilvl="0">
       <w:startOverride w:val="1"/>
     </w:lvlOverride>
   </w:num>
-  <w:num w:numId="3">
-    <w:abstractNumId w:val="3"/>
+  <w:num w:numId="4">
+    <w:abstractNumId w:val="4"/>
     <w:lvlOverride w:ilvl="0">
       <w:startOverride w:val="1"/>
     </w:lvlOverride>
@@ -1539,42 +1698,5 @@
       <w:szCs w:val="20"/>
     </w:rPr>
   </w:style>
-  <w:style w:type="paragraph" w:styleId="Title">
-    <w:name w:val="Title"/>
-    <w:basedOn w:val="Normal"/>
-    <w:rPr>
-      <w:b/>
-      <w:bCs/>
-      <w:color w:val="1F3864"/>
-      <w:sz w:val="40"/>
-      <w:szCs w:val="40"/>
-    </w:rPr>
-  </w:style>
-  <w:style w:type="paragraph" w:styleId="Heading1">
-    <w:name w:val="Heading 1"/>
-    <w:basedOn w:val="Normal"/>
-    <w:next w:val="Normal"/>
-    <w:qFormat/>
-    <w:rPr>
-      <w:b/>
-      <w:bCs/>
-      <w:color w:val="1F3864"/>
-      <w:sz w:val="28"/>
-      <w:szCs w:val="28"/>
-    </w:rPr>
-  </w:style>
-  <w:style w:type="paragraph" w:styleId="Heading2">
-    <w:name w:val="Heading 2"/>
-    <w:basedOn w:val="Normal"/>
-    <w:next w:val="Normal"/>
-    <w:qFormat/>
-    <w:rPr>
-      <w:b/>
-      <w:bCs/>
-      <w:color w:val="2E5E4E"/>
-      <w:sz w:val="24"/>
-      <w:szCs w:val="24"/>
-    </w:rPr>
-  </w:style>
 </w:styles>
 </file>
</xml_diff>